<commit_message>
docs(release): verify permanent admin and close handoff
</commit_message>
<xml_diff>
--- a/CAPSTONE_OS/04_OUTPUT/report/VIETNAMESE_ENTERPRISE_RAG_FINAL_REPORT.docx
+++ b/CAPSTONE_OS/04_OUTPUT/report/VIETNAMESE_ENTERPRISE_RAG_FINAL_REPORT.docx
@@ -3389,7 +3389,18 @@
           <w:i w:val="0"/>
           <w:sz w:val="22"/>
         </w:rPr>
-        <w:t>Permanent admin cần user tự bootstrap bằng credential không ghi vào log/Git.</w:t>
+        <w:t>Permanent admin đã bootstrap; public login và trang Quản trị đã kiểm chứng.</w:t>
+      </w:r>
+    </w:p>
+    <w:p>
+      <w:r>
+        <w:rPr>
+          <w:rFonts w:ascii="Calibri" w:hAnsi="Calibri"/>
+          <w:b w:val="0"/>
+          <w:i w:val="0"/>
+          <w:sz w:val="22"/>
+        </w:rPr>
+        <w:t>Credential không được ghi vào report, artifact, log hoặc Git.</w:t>
       </w:r>
     </w:p>
     <w:p>

</xml_diff>